<commit_message>
docs: update test contract document
Co-Authored-By: Claude Opus 4.7 <noreply@anthropic.com>
</commit_message>
<xml_diff>
--- a/docs/技术服务标准合同-测试.docx
+++ b/docs/技术服务标准合同-测试.docx
@@ -497,15 +497,13 @@
           <w:lang w:eastAsia="zh-CN"/>
         </w:rPr>
       </w:pPr>
-      <w:bookmarkStart w:id="0" w:name="_GoBack"/>
-      <w:bookmarkEnd w:id="0"/>
       <w:r>
         <w:rPr>
           <w:rFonts w:hint="eastAsia"/>
           <w:highlight w:val="cyan"/>
           <w:lang w:eastAsia="zh-CN"/>
         </w:rPr>
-        <w:t>☑ 固定年费：人民币______万元（大写：____________________元整），包含本协议约定的全部技术服务费用。</w:t>
+        <w:t>□ 固定年费：人民币______万元（大写：____________________元整），包含本协议约定的全部技术服务费用。</w:t>
       </w:r>
     </w:p>
     <w:p>
@@ -522,7 +520,7 @@
           <w:highlight w:val="cyan"/>
           <w:lang w:eastAsia="zh-CN"/>
         </w:rPr>
-        <w:t>□ 按次计费：具体服务项目及价格如下：</w:t>
+        <w:t>☑ 按次计费：具体服务项目及价格如下：</w:t>
       </w:r>
     </w:p>
     <w:p>
@@ -540,7 +538,17 @@
           <w:highlight w:val="cyan"/>
           <w:lang w:val="en-US" w:eastAsia="zh-CN"/>
         </w:rPr>
-        <w:t>______________________________________</w:t>
+        <w:t>__________________啊哈哈</w:t>
+      </w:r>
+      <w:bookmarkStart w:id="0" w:name="_GoBack"/>
+      <w:bookmarkEnd w:id="0"/>
+      <w:r>
+        <w:rPr>
+          <w:rFonts w:hint="eastAsia"/>
+          <w:highlight w:val="cyan"/>
+          <w:lang w:val="en-US" w:eastAsia="zh-CN"/>
+        </w:rPr>
+        <w:t>____________________</w:t>
       </w:r>
     </w:p>
     <w:p>

</xml_diff>

<commit_message>
chore: update test documents and database
Co-Authored-By: Claude Opus 4.7 <noreply@anthropic.com>
</commit_message>
<xml_diff>
--- a/docs/技术服务标准合同-测试.docx
+++ b/docs/技术服务标准合同-测试.docx
@@ -25,65 +25,128 @@
           <w:lang w:eastAsia="zh-CN"/>
         </w:rPr>
       </w:pPr>
-      <w:permStart w:id="0" w:edGrp="everyone"/>
-      <w:r>
-        <w:rPr>
-          <w:rFonts w:hint="eastAsia"/>
-          <w:highlight w:val="yellow"/>
-          <w:lang w:eastAsia="zh-CN"/>
-        </w:rPr>
-        <w:t>甲方（委托方）：________________________</w:t>
-      </w:r>
-    </w:p>
-    <w:p>
-      <w:pPr>
-        <w:pStyle w:val="10"/>
-        <w:rPr>
-          <w:highlight w:val="yellow"/>
-          <w:lang w:eastAsia="zh-CN"/>
-        </w:rPr>
-      </w:pPr>
-      <w:r>
-        <w:rPr>
-          <w:rFonts w:hint="eastAsia"/>
-          <w:highlight w:val="yellow"/>
-          <w:lang w:eastAsia="zh-CN"/>
-        </w:rPr>
-        <w:t>统一社会信用代码：______________________</w:t>
-      </w:r>
-    </w:p>
-    <w:p>
-      <w:pPr>
-        <w:pStyle w:val="10"/>
-        <w:rPr>
-          <w:highlight w:val="cyan"/>
-          <w:lang w:eastAsia="zh-CN"/>
-        </w:rPr>
-      </w:pPr>
-      <w:r>
-        <w:rPr>
-          <w:rFonts w:hint="eastAsia"/>
-          <w:highlight w:val="cyan"/>
-          <w:lang w:eastAsia="zh-CN"/>
-        </w:rPr>
-        <w:t>地址：__________________________________</w:t>
-      </w:r>
-    </w:p>
-    <w:p>
-      <w:pPr>
-        <w:pStyle w:val="10"/>
-        <w:rPr>
-          <w:highlight w:val="cyan"/>
-          <w:lang w:eastAsia="zh-CN"/>
-        </w:rPr>
-      </w:pPr>
-      <w:r>
-        <w:rPr>
-          <w:rFonts w:hint="eastAsia"/>
-          <w:highlight w:val="cyan"/>
-          <w:lang w:eastAsia="zh-CN"/>
-        </w:rPr>
-        <w:t>法定代表人/负责人：______________________</w:t>
+      <w:r>
+        <w:rPr>
+          <w:rFonts w:hint="eastAsia"/>
+          <w:highlight w:val="yellow"/>
+          <w:lang w:eastAsia="zh-CN"/>
+        </w:rPr>
+        <w:t>甲方（委托方）：________</w:t>
+      </w:r>
+      <w:r>
+        <w:rPr>
+          <w:rFonts w:hint="eastAsia"/>
+          <w:highlight w:val="yellow"/>
+          <w:lang w:val="en-US" w:eastAsia="zh-CN"/>
+        </w:rPr>
+        <w:t>张三</w:t>
+      </w:r>
+      <w:r>
+        <w:rPr>
+          <w:rFonts w:hint="eastAsia"/>
+          <w:highlight w:val="yellow"/>
+          <w:lang w:eastAsia="zh-CN"/>
+        </w:rPr>
+        <w:t>________________</w:t>
+      </w:r>
+    </w:p>
+    <w:p>
+      <w:pPr>
+        <w:pStyle w:val="10"/>
+        <w:rPr>
+          <w:highlight w:val="yellow"/>
+          <w:lang w:eastAsia="zh-CN"/>
+        </w:rPr>
+      </w:pPr>
+      <w:r>
+        <w:rPr>
+          <w:rFonts w:hint="eastAsia"/>
+          <w:highlight w:val="yellow"/>
+          <w:lang w:eastAsia="zh-CN"/>
+        </w:rPr>
+        <w:t>统一社会信用代码：________</w:t>
+      </w:r>
+      <w:r>
+        <w:rPr>
+          <w:rFonts w:hint="eastAsia"/>
+          <w:highlight w:val="yellow"/>
+          <w:lang w:val="en-US" w:eastAsia="zh-CN"/>
+        </w:rPr>
+        <w:t>1234567</w:t>
+      </w:r>
+      <w:r>
+        <w:rPr>
+          <w:rFonts w:hint="eastAsia"/>
+          <w:highlight w:val="yellow"/>
+          <w:lang w:eastAsia="zh-CN"/>
+        </w:rPr>
+        <w:t>______________</w:t>
+      </w:r>
+    </w:p>
+    <w:p>
+      <w:pPr>
+        <w:pStyle w:val="10"/>
+        <w:rPr>
+          <w:highlight w:val="cyan"/>
+          <w:lang w:eastAsia="zh-CN"/>
+        </w:rPr>
+      </w:pPr>
+      <w:r>
+        <w:rPr>
+          <w:rFonts w:hint="eastAsia"/>
+          <w:highlight w:val="cyan"/>
+          <w:lang w:eastAsia="zh-CN"/>
+        </w:rPr>
+        <w:t>地址：_____________</w:t>
+      </w:r>
+      <w:r>
+        <w:rPr>
+          <w:rFonts w:hint="eastAsia"/>
+          <w:highlight w:val="cyan"/>
+          <w:lang w:val="en-US" w:eastAsia="zh-CN"/>
+        </w:rPr>
+        <w:t>重庆</w:t>
+      </w:r>
+      <w:r>
+        <w:rPr>
+          <w:rFonts w:hint="eastAsia"/>
+          <w:highlight w:val="cyan"/>
+          <w:lang w:eastAsia="zh-CN"/>
+        </w:rPr>
+        <w:t>_____________________</w:t>
+      </w:r>
+    </w:p>
+    <w:p>
+      <w:pPr>
+        <w:pStyle w:val="10"/>
+        <w:rPr>
+          <w:highlight w:val="cyan"/>
+          <w:lang w:eastAsia="zh-CN"/>
+        </w:rPr>
+      </w:pPr>
+      <w:r>
+        <w:rPr>
+          <w:rFonts w:hint="eastAsia"/>
+          <w:highlight w:val="cyan"/>
+          <w:lang w:eastAsia="zh-CN"/>
+        </w:rPr>
+        <w:t>法定代表人/负责人：______</w:t>
+      </w:r>
+      <w:r>
+        <w:rPr>
+          <w:rFonts w:hint="eastAsia"/>
+          <w:highlight w:val="cyan"/>
+          <w:lang w:val="en-US" w:eastAsia="zh-CN"/>
+        </w:rPr>
+        <w:t>李四</w:t>
+      </w:r>
+      <w:r>
+        <w:rPr>
+          <w:rFonts w:hint="eastAsia"/>
+          <w:highlight w:val="cyan"/>
+          <w:lang w:eastAsia="zh-CN"/>
+        </w:rPr>
+        <w:t>________________</w:t>
       </w:r>
     </w:p>
     <w:p>
@@ -124,76 +187,167 @@
           <w:highlight w:val="yellow"/>
           <w:lang w:eastAsia="zh-CN"/>
         </w:rPr>
-        <w:t>乙方（服务方）：________________________</w:t>
-      </w:r>
-    </w:p>
-    <w:p>
-      <w:pPr>
-        <w:pStyle w:val="10"/>
-        <w:rPr>
-          <w:highlight w:val="yellow"/>
-          <w:lang w:eastAsia="zh-CN"/>
-        </w:rPr>
-      </w:pPr>
-      <w:r>
-        <w:rPr>
-          <w:rFonts w:hint="eastAsia"/>
-          <w:highlight w:val="yellow"/>
-          <w:lang w:eastAsia="zh-CN"/>
-        </w:rPr>
-        <w:t>统一社会信用代码：______________________</w:t>
-      </w:r>
-    </w:p>
-    <w:p>
-      <w:pPr>
-        <w:pStyle w:val="10"/>
-        <w:rPr>
-          <w:highlight w:val="cyan"/>
-          <w:lang w:eastAsia="zh-CN"/>
-        </w:rPr>
-      </w:pPr>
-      <w:r>
-        <w:rPr>
-          <w:rFonts w:hint="eastAsia"/>
-          <w:highlight w:val="cyan"/>
-          <w:lang w:eastAsia="zh-CN"/>
-        </w:rPr>
-        <w:t>地址：__________________________________</w:t>
-      </w:r>
-    </w:p>
-    <w:p>
-      <w:pPr>
-        <w:pStyle w:val="10"/>
-        <w:rPr>
-          <w:highlight w:val="cyan"/>
-          <w:lang w:eastAsia="zh-CN"/>
-        </w:rPr>
-      </w:pPr>
-      <w:r>
-        <w:rPr>
-          <w:rFonts w:hint="eastAsia"/>
-          <w:highlight w:val="cyan"/>
-          <w:lang w:eastAsia="zh-CN"/>
-        </w:rPr>
-        <w:t>法定代表人/负责人：______________________</w:t>
-      </w:r>
-    </w:p>
-    <w:p>
-      <w:pPr>
-        <w:pStyle w:val="10"/>
-        <w:rPr>
-          <w:lang w:eastAsia="zh-CN"/>
-        </w:rPr>
-      </w:pPr>
-      <w:r>
-        <w:rPr>
-          <w:rFonts w:hint="eastAsia"/>
-          <w:lang w:eastAsia="zh-CN"/>
-        </w:rPr>
-        <w:t>联系人：____________________ 联系电话：____________________</w:t>
-      </w:r>
-    </w:p>
-    <w:permEnd w:id="0"/>
+        <w:t>乙方（服务方）：_________</w:t>
+      </w:r>
+      <w:r>
+        <w:rPr>
+          <w:rFonts w:hint="eastAsia"/>
+          <w:highlight w:val="yellow"/>
+          <w:lang w:val="en-US" w:eastAsia="zh-CN"/>
+        </w:rPr>
+        <w:t>王五</w:t>
+      </w:r>
+      <w:r>
+        <w:rPr>
+          <w:rFonts w:hint="eastAsia"/>
+          <w:highlight w:val="yellow"/>
+          <w:lang w:eastAsia="zh-CN"/>
+        </w:rPr>
+        <w:t>_______________</w:t>
+      </w:r>
+    </w:p>
+    <w:p>
+      <w:pPr>
+        <w:pStyle w:val="10"/>
+        <w:rPr>
+          <w:highlight w:val="yellow"/>
+          <w:lang w:eastAsia="zh-CN"/>
+        </w:rPr>
+      </w:pPr>
+      <w:r>
+        <w:rPr>
+          <w:rFonts w:hint="eastAsia"/>
+          <w:highlight w:val="yellow"/>
+          <w:lang w:eastAsia="zh-CN"/>
+        </w:rPr>
+        <w:t>统一社会信用代码：________</w:t>
+      </w:r>
+      <w:r>
+        <w:rPr>
+          <w:rFonts w:hint="eastAsia"/>
+          <w:highlight w:val="yellow"/>
+          <w:lang w:val="en-US" w:eastAsia="zh-CN"/>
+        </w:rPr>
+        <w:t>2354667</w:t>
+      </w:r>
+      <w:r>
+        <w:rPr>
+          <w:rFonts w:hint="eastAsia"/>
+          <w:highlight w:val="yellow"/>
+          <w:lang w:eastAsia="zh-CN"/>
+        </w:rPr>
+        <w:t>______________</w:t>
+      </w:r>
+    </w:p>
+    <w:p>
+      <w:pPr>
+        <w:pStyle w:val="10"/>
+        <w:rPr>
+          <w:highlight w:val="cyan"/>
+          <w:lang w:eastAsia="zh-CN"/>
+        </w:rPr>
+      </w:pPr>
+      <w:r>
+        <w:rPr>
+          <w:rFonts w:hint="eastAsia"/>
+          <w:highlight w:val="cyan"/>
+          <w:lang w:eastAsia="zh-CN"/>
+        </w:rPr>
+        <w:t>地址：_______________</w:t>
+      </w:r>
+      <w:r>
+        <w:rPr>
+          <w:rFonts w:hint="eastAsia"/>
+          <w:highlight w:val="cyan"/>
+          <w:lang w:val="en-US" w:eastAsia="zh-CN"/>
+        </w:rPr>
+        <w:t>四川</w:t>
+      </w:r>
+      <w:r>
+        <w:rPr>
+          <w:rFonts w:hint="eastAsia"/>
+          <w:highlight w:val="cyan"/>
+          <w:lang w:eastAsia="zh-CN"/>
+        </w:rPr>
+        <w:t>___________________</w:t>
+      </w:r>
+    </w:p>
+    <w:p>
+      <w:pPr>
+        <w:pStyle w:val="10"/>
+        <w:rPr>
+          <w:highlight w:val="cyan"/>
+          <w:lang w:eastAsia="zh-CN"/>
+        </w:rPr>
+      </w:pPr>
+      <w:r>
+        <w:rPr>
+          <w:rFonts w:hint="eastAsia"/>
+          <w:highlight w:val="cyan"/>
+          <w:lang w:eastAsia="zh-CN"/>
+        </w:rPr>
+        <w:t>法定代表人/负责人：_________</w:t>
+      </w:r>
+      <w:r>
+        <w:rPr>
+          <w:rFonts w:hint="eastAsia"/>
+          <w:highlight w:val="cyan"/>
+          <w:lang w:val="en-US" w:eastAsia="zh-CN"/>
+        </w:rPr>
+        <w:t>张飞</w:t>
+      </w:r>
+      <w:r>
+        <w:rPr>
+          <w:rFonts w:hint="eastAsia"/>
+          <w:highlight w:val="cyan"/>
+          <w:lang w:eastAsia="zh-CN"/>
+        </w:rPr>
+        <w:t>_____________</w:t>
+      </w:r>
+    </w:p>
+    <w:p>
+      <w:pPr>
+        <w:pStyle w:val="10"/>
+        <w:rPr>
+          <w:lang w:eastAsia="zh-CN"/>
+        </w:rPr>
+      </w:pPr>
+      <w:r>
+        <w:rPr>
+          <w:rFonts w:hint="eastAsia"/>
+          <w:lang w:eastAsia="zh-CN"/>
+        </w:rPr>
+        <w:t>联系人：_______</w:t>
+      </w:r>
+      <w:r>
+        <w:rPr>
+          <w:rFonts w:hint="eastAsia"/>
+          <w:lang w:val="en-US" w:eastAsia="zh-CN"/>
+        </w:rPr>
+        <w:t>刘备</w:t>
+      </w:r>
+      <w:r>
+        <w:rPr>
+          <w:rFonts w:hint="eastAsia"/>
+          <w:lang w:eastAsia="zh-CN"/>
+        </w:rPr>
+        <w:t>_____________ 联系电话：________</w:t>
+      </w:r>
+      <w:r>
+        <w:rPr>
+          <w:rFonts w:hint="eastAsia"/>
+          <w:lang w:val="en-US" w:eastAsia="zh-CN"/>
+        </w:rPr>
+        <w:t>174837</w:t>
+      </w:r>
+      <w:r>
+        <w:rPr>
+          <w:rFonts w:hint="eastAsia"/>
+          <w:lang w:eastAsia="zh-CN"/>
+        </w:rPr>
+        <w:t>____________</w:t>
+      </w:r>
+    </w:p>
     <w:p>
       <w:pPr>
         <w:pStyle w:val="10"/>
@@ -344,7 +498,6 @@
           <w:lang w:eastAsia="zh-CN"/>
         </w:rPr>
       </w:pPr>
-      <w:permStart w:id="1" w:edGrp="everyone"/>
       <w:r>
         <w:rPr>
           <w:rFonts w:hint="eastAsia"/>
@@ -375,10 +528,25 @@
           <w:highlight w:val="yellow"/>
           <w:lang w:eastAsia="zh-CN"/>
         </w:rPr>
-        <w:t>__________________________________________________________</w:t>
-      </w:r>
-    </w:p>
-    <w:permEnd w:id="1"/>
+        <w:t>____________________________</w:t>
+      </w:r>
+      <w:r>
+        <w:rPr>
+          <w:rFonts w:hint="eastAsia"/>
+          <w:highlight w:val="yellow"/>
+          <w:lang w:val="en-US" w:eastAsia="zh-CN"/>
+        </w:rPr>
+        <w:t>增加预算</w:t>
+      </w:r>
+      <w:r>
+        <w:rPr>
+          <w:rFonts w:hint="eastAsia"/>
+          <w:highlight w:val="yellow"/>
+          <w:lang w:eastAsia="zh-CN"/>
+        </w:rPr>
+        <w:t>______________________________</w:t>
+      </w:r>
+    </w:p>
     <w:p>
       <w:pPr>
         <w:pStyle w:val="10"/>
@@ -417,30 +585,154 @@
           <w:lang w:eastAsia="zh-CN"/>
         </w:rPr>
       </w:pPr>
-      <w:permStart w:id="2" w:edGrp="everyone"/>
-      <w:r>
-        <w:rPr>
-          <w:rFonts w:hint="eastAsia"/>
-          <w:highlight w:val="yellow"/>
-          <w:lang w:eastAsia="zh-CN"/>
-        </w:rPr>
-        <w:t>2.1 本协议项下技术服务期限自______年____月____日起至______年____月____日止，有效期____年。</w:t>
-      </w:r>
-    </w:p>
-    <w:permEnd w:id="2"/>
-    <w:p>
-      <w:pPr>
-        <w:pStyle w:val="10"/>
-        <w:rPr>
-          <w:lang w:eastAsia="zh-CN"/>
-        </w:rPr>
-      </w:pPr>
-      <w:r>
-        <w:rPr>
-          <w:rFonts w:hint="eastAsia"/>
-          <w:lang w:eastAsia="zh-CN"/>
-        </w:rPr>
-        <w:t>2.2 本协议服务期满前30日内，乙方应通知甲方是否继续使用相关服务，若甲方继续使用，双方应另行签署服务协议。</w:t>
+      <w:r>
+        <w:rPr>
+          <w:rFonts w:hint="eastAsia"/>
+          <w:highlight w:val="yellow"/>
+          <w:lang w:eastAsia="zh-CN"/>
+        </w:rPr>
+        <w:t>2.1 本协议项下技术服务期限自___</w:t>
+      </w:r>
+      <w:r>
+        <w:rPr>
+          <w:rFonts w:hint="eastAsia"/>
+          <w:highlight w:val="yellow"/>
+          <w:lang w:val="en-US" w:eastAsia="zh-CN"/>
+        </w:rPr>
+        <w:t>2023</w:t>
+      </w:r>
+      <w:r>
+        <w:rPr>
+          <w:rFonts w:hint="eastAsia"/>
+          <w:highlight w:val="yellow"/>
+          <w:lang w:eastAsia="zh-CN"/>
+        </w:rPr>
+        <w:t>___年__</w:t>
+      </w:r>
+      <w:r>
+        <w:rPr>
+          <w:rFonts w:hint="eastAsia"/>
+          <w:highlight w:val="yellow"/>
+          <w:lang w:val="en-US" w:eastAsia="zh-CN"/>
+        </w:rPr>
+        <w:t>2</w:t>
+      </w:r>
+      <w:r>
+        <w:rPr>
+          <w:rFonts w:hint="eastAsia"/>
+          <w:highlight w:val="yellow"/>
+          <w:lang w:eastAsia="zh-CN"/>
+        </w:rPr>
+        <w:t>__月__</w:t>
+      </w:r>
+      <w:r>
+        <w:rPr>
+          <w:rFonts w:hint="eastAsia"/>
+          <w:highlight w:val="yellow"/>
+          <w:lang w:val="en-US" w:eastAsia="zh-CN"/>
+        </w:rPr>
+        <w:t>1</w:t>
+      </w:r>
+      <w:r>
+        <w:rPr>
+          <w:rFonts w:hint="eastAsia"/>
+          <w:highlight w:val="yellow"/>
+          <w:lang w:eastAsia="zh-CN"/>
+        </w:rPr>
+        <w:t>__日起至____</w:t>
+      </w:r>
+      <w:r>
+        <w:rPr>
+          <w:rFonts w:hint="eastAsia"/>
+          <w:highlight w:val="yellow"/>
+          <w:lang w:val="en-US" w:eastAsia="zh-CN"/>
+        </w:rPr>
+        <w:t>2024</w:t>
+      </w:r>
+      <w:r>
+        <w:rPr>
+          <w:rFonts w:hint="eastAsia"/>
+          <w:highlight w:val="yellow"/>
+          <w:lang w:eastAsia="zh-CN"/>
+        </w:rPr>
+        <w:t>__年__</w:t>
+      </w:r>
+      <w:r>
+        <w:rPr>
+          <w:rFonts w:hint="eastAsia"/>
+          <w:highlight w:val="yellow"/>
+          <w:lang w:val="en-US" w:eastAsia="zh-CN"/>
+        </w:rPr>
+        <w:t>3</w:t>
+      </w:r>
+      <w:r>
+        <w:rPr>
+          <w:rFonts w:hint="eastAsia"/>
+          <w:highlight w:val="yellow"/>
+          <w:lang w:eastAsia="zh-CN"/>
+        </w:rPr>
+        <w:t>__月_</w:t>
+      </w:r>
+      <w:r>
+        <w:rPr>
+          <w:rFonts w:hint="eastAsia"/>
+          <w:highlight w:val="yellow"/>
+          <w:lang w:val="en-US" w:eastAsia="zh-CN"/>
+        </w:rPr>
+        <w:t>5</w:t>
+      </w:r>
+      <w:r>
+        <w:rPr>
+          <w:rFonts w:hint="eastAsia"/>
+          <w:highlight w:val="yellow"/>
+          <w:lang w:eastAsia="zh-CN"/>
+        </w:rPr>
+        <w:t>___日止，有效期___</w:t>
+      </w:r>
+      <w:r>
+        <w:rPr>
+          <w:rFonts w:hint="eastAsia"/>
+          <w:highlight w:val="yellow"/>
+          <w:lang w:val="en-US" w:eastAsia="zh-CN"/>
+        </w:rPr>
+        <w:t>2</w:t>
+      </w:r>
+      <w:r>
+        <w:rPr>
+          <w:rFonts w:hint="eastAsia"/>
+          <w:highlight w:val="yellow"/>
+          <w:lang w:eastAsia="zh-CN"/>
+        </w:rPr>
+        <w:t>_年。</w:t>
+      </w:r>
+    </w:p>
+    <w:p>
+      <w:pPr>
+        <w:pStyle w:val="10"/>
+        <w:rPr>
+          <w:lang w:eastAsia="zh-CN"/>
+        </w:rPr>
+      </w:pPr>
+      <w:r>
+        <w:rPr>
+          <w:rFonts w:hint="eastAsia"/>
+          <w:lang w:eastAsia="zh-CN"/>
+        </w:rPr>
+        <w:t>2.2 本协议服务期满前</w:t>
+      </w:r>
+      <w:r>
+        <w:rPr>
+          <w:rFonts w:hint="eastAsia"/>
+          <w:lang w:val="en-US" w:eastAsia="zh-CN"/>
+        </w:rPr>
+        <w:t>29</w:t>
+      </w:r>
+      <w:r>
+        <w:rPr>
+          <w:rFonts w:hint="eastAsia"/>
+          <w:lang w:eastAsia="zh-CN"/>
+        </w:rPr>
+        <w:t>日内，乙方应通知甲方是否继续使用相关服务，若甲方继续使用，双方应另行签署服务协议。</w:t>
       </w:r>
     </w:p>
     <w:p>
@@ -480,7 +772,6 @@
           <w:lang w:eastAsia="zh-CN"/>
         </w:rPr>
       </w:pPr>
-      <w:permStart w:id="3" w:edGrp="everyone"/>
       <w:r>
         <w:rPr>
           <w:rFonts w:hint="eastAsia"/>
@@ -503,24 +794,56 @@
           <w:highlight w:val="cyan"/>
           <w:lang w:eastAsia="zh-CN"/>
         </w:rPr>
-        <w:t>□ 固定年费：人民币______万元（大写：____________________元整），包含本协议约定的全部技术服务费用。</w:t>
-      </w:r>
-    </w:p>
-    <w:p>
-      <w:pPr>
-        <w:pStyle w:val="10"/>
-        <w:rPr>
-          <w:highlight w:val="cyan"/>
-          <w:lang w:eastAsia="zh-CN"/>
-        </w:rPr>
-      </w:pPr>
-      <w:r>
-        <w:rPr>
-          <w:rFonts w:hint="eastAsia"/>
-          <w:highlight w:val="cyan"/>
-          <w:lang w:eastAsia="zh-CN"/>
-        </w:rPr>
-        <w:t>☑ 按次计费：具体服务项目及价格如下：</w:t>
+        <w:t>□ 固定年费：人民币____</w:t>
+      </w:r>
+      <w:r>
+        <w:rPr>
+          <w:rFonts w:hint="eastAsia"/>
+          <w:highlight w:val="cyan"/>
+          <w:lang w:val="en-US" w:eastAsia="zh-CN"/>
+        </w:rPr>
+        <w:t>2</w:t>
+      </w:r>
+      <w:r>
+        <w:rPr>
+          <w:rFonts w:hint="eastAsia"/>
+          <w:highlight w:val="cyan"/>
+          <w:lang w:eastAsia="zh-CN"/>
+        </w:rPr>
+        <w:t>__万元（大写：_______</w:t>
+      </w:r>
+      <w:r>
+        <w:rPr>
+          <w:rFonts w:hint="eastAsia"/>
+          <w:highlight w:val="cyan"/>
+          <w:lang w:val="en-US" w:eastAsia="zh-CN"/>
+        </w:rPr>
+        <w:t>二万</w:t>
+      </w:r>
+      <w:r>
+        <w:rPr>
+          <w:rFonts w:hint="eastAsia"/>
+          <w:highlight w:val="cyan"/>
+          <w:lang w:eastAsia="zh-CN"/>
+        </w:rPr>
+        <w:t>_____________元整），包含本协议约定的全部技术服务费用。</w:t>
+      </w:r>
+    </w:p>
+    <w:p>
+      <w:pPr>
+        <w:pStyle w:val="10"/>
+        <w:rPr>
+          <w:highlight w:val="cyan"/>
+          <w:lang w:eastAsia="zh-CN"/>
+        </w:rPr>
+      </w:pPr>
+      <w:r>
+        <w:rPr>
+          <w:rFonts w:hint="eastAsia"/>
+          <w:highlight w:val="cyan"/>
+          <w:lang w:eastAsia="zh-CN"/>
+        </w:rPr>
+        <w:t>□ 按次计费：具体服务项目及价格如下：</w:t>
       </w:r>
     </w:p>
     <w:p>
@@ -538,34 +861,24 @@
           <w:highlight w:val="cyan"/>
           <w:lang w:val="en-US" w:eastAsia="zh-CN"/>
         </w:rPr>
-        <w:t>__________________啊哈哈</w:t>
-      </w:r>
-      <w:bookmarkStart w:id="0" w:name="_GoBack"/>
-      <w:bookmarkEnd w:id="0"/>
-      <w:r>
-        <w:rPr>
-          <w:rFonts w:hint="eastAsia"/>
+        <w:t>______________________________________</w:t>
+      </w:r>
+    </w:p>
+    <w:p>
+      <w:pPr>
+        <w:pStyle w:val="10"/>
+        <w:rPr>
+          <w:rFonts w:hint="default"/>
           <w:highlight w:val="cyan"/>
           <w:lang w:val="en-US" w:eastAsia="zh-CN"/>
         </w:rPr>
-        <w:t>____________________</w:t>
-      </w:r>
-    </w:p>
-    <w:p>
-      <w:pPr>
-        <w:pStyle w:val="10"/>
-        <w:rPr>
-          <w:rFonts w:hint="default"/>
+      </w:pPr>
+      <w:r>
+        <w:rPr>
+          <w:rFonts w:hint="eastAsia"/>
           <w:highlight w:val="cyan"/>
           <w:lang w:val="en-US" w:eastAsia="zh-CN"/>
         </w:rPr>
-      </w:pPr>
-      <w:r>
-        <w:rPr>
-          <w:rFonts w:hint="eastAsia"/>
-          <w:highlight w:val="cyan"/>
-          <w:lang w:val="en-US" w:eastAsia="zh-CN"/>
-        </w:rPr>
         <w:t>______________________________________</w:t>
       </w:r>
     </w:p>
@@ -620,7 +933,6 @@
         <w:t>□ 其他计价方式：____________________________________________________</w:t>
       </w:r>
     </w:p>
-    <w:permEnd w:id="3"/>
     <w:p>
       <w:pPr>
         <w:pStyle w:val="9"/>
@@ -853,7 +1165,6 @@
           <w:lang w:eastAsia="zh-CN"/>
         </w:rPr>
       </w:pPr>
-      <w:permStart w:id="4" w:edGrp="everyone"/>
       <w:r>
         <w:rPr>
           <w:rFonts w:hint="eastAsia"/>
@@ -878,7 +1189,23 @@
           <w:highlight w:val="cyan"/>
           <w:lang w:eastAsia="zh-CN"/>
         </w:rPr>
-        <w:t>账户名称：________________________</w:t>
+        <w:t>账户名称：_________</w:t>
+      </w:r>
+      <w:r>
+        <w:rPr>
+          <w:rFonts w:hint="eastAsia"/>
+          <w:highlight w:val="cyan"/>
+          <w:lang w:val="en-US" w:eastAsia="zh-CN"/>
+        </w:rPr>
+        <w:t>四川</w:t>
+      </w:r>
+      <w:r>
+        <w:rPr>
+          <w:rFonts w:hint="eastAsia"/>
+          <w:highlight w:val="cyan"/>
+          <w:lang w:eastAsia="zh-CN"/>
+        </w:rPr>
+        <w:t>_______________</w:t>
       </w:r>
     </w:p>
     <w:p>
@@ -896,7 +1223,23 @@
           <w:highlight w:val="cyan"/>
           <w:lang w:eastAsia="zh-CN"/>
         </w:rPr>
-        <w:t>开户行：__________________________</w:t>
+        <w:t>开户行：___________</w:t>
+      </w:r>
+      <w:r>
+        <w:rPr>
+          <w:rFonts w:hint="eastAsia"/>
+          <w:highlight w:val="cyan"/>
+          <w:lang w:val="en-US" w:eastAsia="zh-CN"/>
+        </w:rPr>
+        <w:t>四川银行</w:t>
+      </w:r>
+      <w:r>
+        <w:rPr>
+          <w:rFonts w:hint="eastAsia"/>
+          <w:highlight w:val="cyan"/>
+          <w:lang w:eastAsia="zh-CN"/>
+        </w:rPr>
+        <w:t>_______________</w:t>
       </w:r>
     </w:p>
     <w:p>
@@ -914,7 +1257,23 @@
           <w:highlight w:val="cyan"/>
           <w:lang w:eastAsia="zh-CN"/>
         </w:rPr>
-        <w:t>账号：____________________________</w:t>
+        <w:t>账号：___________</w:t>
+      </w:r>
+      <w:r>
+        <w:rPr>
+          <w:rFonts w:hint="eastAsia"/>
+          <w:highlight w:val="cyan"/>
+          <w:lang w:val="en-US" w:eastAsia="zh-CN"/>
+        </w:rPr>
+        <w:t>12355</w:t>
+      </w:r>
+      <w:r>
+        <w:rPr>
+          <w:rFonts w:hint="eastAsia"/>
+          <w:highlight w:val="cyan"/>
+          <w:lang w:eastAsia="zh-CN"/>
+        </w:rPr>
+        <w:t>_________________</w:t>
       </w:r>
     </w:p>
     <w:p>
@@ -968,7 +1327,23 @@
           <w:highlight w:val="yellow"/>
           <w:lang w:eastAsia="zh-CN"/>
         </w:rPr>
-        <w:t>账户名称：________________________</w:t>
+        <w:t>账户名称：_________</w:t>
+      </w:r>
+      <w:r>
+        <w:rPr>
+          <w:rFonts w:hint="eastAsia"/>
+          <w:highlight w:val="yellow"/>
+          <w:lang w:val="en-US" w:eastAsia="zh-CN"/>
+        </w:rPr>
+        <w:t>关羽</w:t>
+      </w:r>
+      <w:r>
+        <w:rPr>
+          <w:rFonts w:hint="eastAsia"/>
+          <w:highlight w:val="yellow"/>
+          <w:lang w:eastAsia="zh-CN"/>
+        </w:rPr>
+        <w:t>_______________</w:t>
       </w:r>
     </w:p>
     <w:p>
@@ -1007,7 +1382,6 @@
         <w:t>账号：____________________________</w:t>
       </w:r>
     </w:p>
-    <w:permEnd w:id="4"/>
     <w:p>
       <w:pPr>
         <w:pStyle w:val="10"/>
@@ -2475,8 +2849,6 @@
                 <w:highlight w:val="yellow"/>
               </w:rPr>
             </w:pPr>
-            <w:permStart w:id="5" w:edGrp="everyone" w:colFirst="0" w:colLast="0"/>
-            <w:permStart w:id="6" w:edGrp="everyone" w:colFirst="1" w:colLast="1"/>
             <w:r>
               <w:rPr>
                 <w:rFonts w:hint="eastAsia"/>
@@ -2516,8 +2888,6 @@
           </w:p>
         </w:tc>
       </w:tr>
-      <w:permEnd w:id="5"/>
-      <w:permEnd w:id="6"/>
       <w:tr>
         <w:tblPrEx>
           <w:tblBorders>
@@ -2549,12 +2919,11 @@
             <w:pPr>
               <w:spacing w:after="0"/>
               <w:rPr>
+                <w:rFonts w:hint="default"/>
                 <w:highlight w:val="yellow"/>
-                <w:lang w:eastAsia="zh-CN"/>
+                <w:lang w:val="en-US" w:eastAsia="zh-CN"/>
               </w:rPr>
             </w:pPr>
-            <w:permStart w:id="7" w:edGrp="everyone" w:colFirst="0" w:colLast="0"/>
-            <w:permStart w:id="8" w:edGrp="everyone" w:colFirst="1" w:colLast="1"/>
             <w:r>
               <w:rPr>
                 <w:rFonts w:hint="eastAsia"/>
@@ -2562,6 +2931,14 @@
                 <w:lang w:eastAsia="zh-CN"/>
               </w:rPr>
               <w:t>法定代表人/授权代表（签字/盖章）：</w:t>
+            </w:r>
+            <w:r>
+              <w:rPr>
+                <w:rFonts w:hint="eastAsia"/>
+                <w:highlight w:val="yellow"/>
+                <w:lang w:val="en-US" w:eastAsia="zh-CN"/>
+              </w:rPr>
+              <w:t>王三</w:t>
             </w:r>
           </w:p>
         </w:tc>
@@ -2579,8 +2956,9 @@
             <w:pPr>
               <w:spacing w:after="0"/>
               <w:rPr>
+                <w:rFonts w:hint="default"/>
                 <w:highlight w:val="yellow"/>
-                <w:lang w:eastAsia="zh-CN"/>
+                <w:lang w:val="en-US" w:eastAsia="zh-CN"/>
               </w:rPr>
             </w:pPr>
             <w:r>
@@ -2591,11 +2969,17 @@
               </w:rPr>
               <w:t>法定代表人/授权代表（签字/盖章）：</w:t>
             </w:r>
+            <w:r>
+              <w:rPr>
+                <w:rFonts w:hint="eastAsia"/>
+                <w:highlight w:val="yellow"/>
+                <w:lang w:val="en-US" w:eastAsia="zh-CN"/>
+              </w:rPr>
+              <w:t>诸葛</w:t>
+            </w:r>
           </w:p>
         </w:tc>
       </w:tr>
-      <w:permEnd w:id="7"/>
-      <w:permEnd w:id="8"/>
       <w:tr>
         <w:tblPrEx>
           <w:tblBorders>
@@ -2630,8 +3014,6 @@
                 <w:highlight w:val="yellow"/>
               </w:rPr>
             </w:pPr>
-            <w:permStart w:id="9" w:edGrp="everyone" w:colFirst="0" w:colLast="0"/>
-            <w:permStart w:id="10" w:edGrp="everyone" w:colFirst="1" w:colLast="1"/>
             <w:r>
               <w:rPr>
                 <w:rFonts w:hint="eastAsia"/>
@@ -2668,8 +3050,6 @@
           </w:p>
         </w:tc>
       </w:tr>
-      <w:permEnd w:id="9"/>
-      <w:permEnd w:id="10"/>
       <w:tr>
         <w:tblPrEx>
           <w:tblBorders>
@@ -2704,14 +3084,29 @@
                 <w:highlight w:val="yellow"/>
               </w:rPr>
             </w:pPr>
-            <w:permStart w:id="11" w:edGrp="everyone" w:colFirst="0" w:colLast="0"/>
-            <w:permStart w:id="12" w:edGrp="everyone" w:colFirst="1" w:colLast="1"/>
             <w:r>
               <w:rPr>
                 <w:rFonts w:hint="eastAsia"/>
                 <w:highlight w:val="yellow"/>
               </w:rPr>
-              <w:t>日期：______年____月____日</w:t>
+              <w:t>日期：___</w:t>
+            </w:r>
+            <w:r>
+              <w:rPr>
+                <w:rFonts w:hint="eastAsia"/>
+                <w:highlight w:val="yellow"/>
+                <w:lang w:val="en-US" w:eastAsia="zh-CN"/>
+              </w:rPr>
+              <w:t>2025</w:t>
+            </w:r>
+            <w:bookmarkStart w:id="0" w:name="_GoBack"/>
+            <w:bookmarkEnd w:id="0"/>
+            <w:r>
+              <w:rPr>
+                <w:rFonts w:hint="eastAsia"/>
+                <w:highlight w:val="yellow"/>
+              </w:rPr>
+              <w:t>___年____月____日</w:t>
             </w:r>
           </w:p>
         </w:tc>
@@ -2737,13 +3132,26 @@
                 <w:rFonts w:hint="eastAsia"/>
                 <w:highlight w:val="yellow"/>
               </w:rPr>
-              <w:t>日期：______年____月____日</w:t>
+              <w:t>日期：__</w:t>
+            </w:r>
+            <w:r>
+              <w:rPr>
+                <w:rFonts w:hint="eastAsia"/>
+                <w:highlight w:val="yellow"/>
+                <w:lang w:val="en-US" w:eastAsia="zh-CN"/>
+              </w:rPr>
+              <w:t>2022</w:t>
+            </w:r>
+            <w:r>
+              <w:rPr>
+                <w:rFonts w:hint="eastAsia"/>
+                <w:highlight w:val="yellow"/>
+              </w:rPr>
+              <w:t>____年____月____日</w:t>
             </w:r>
           </w:p>
         </w:tc>
       </w:tr>
-      <w:permEnd w:id="11"/>
-      <w:permEnd w:id="12"/>
     </w:tbl>
     <w:p/>
     <w:p/>

</xml_diff>

<commit_message>
chore: update test fixtures and integration docs
Co-Authored-By: Claude Opus 4.7 <noreply@anthropic.com>
</commit_message>
<xml_diff>
--- a/docs/技术服务标准合同-测试.docx
+++ b/docs/技术服务标准合同-测试.docx
@@ -170,7 +170,7 @@
           <w:sz w:val="24"/>
           <w:szCs w:val="24"/>
         </w:rPr>
-        <w:t>李 然</w:t>
+        <w:t>李然</w:t>
       </w:r>
       <w:r>
         <w:rPr>
@@ -712,8 +712,6 @@
         </w:rPr>
         <w:t>□ 按次计费：具体服务项目及价格如下：</w:t>
       </w:r>
-      <w:bookmarkStart w:id="0" w:name="_GoBack"/>
-      <w:bookmarkEnd w:id="0"/>
     </w:p>
     <w:p>
       <w:pPr>
@@ -1136,7 +1134,17 @@
           <w:sz w:val="24"/>
           <w:szCs w:val="24"/>
         </w:rPr>
-        <w:t>0200 0010 0910 0012 345</w:t>
+        <w:t>0200001009100012</w:t>
+      </w:r>
+      <w:bookmarkStart w:id="0" w:name="_GoBack"/>
+      <w:bookmarkEnd w:id="0"/>
+      <w:r>
+        <w:rPr>
+          <w:rFonts w:ascii="宋体" w:hAnsi="宋体" w:eastAsia="宋体" w:cs="宋体"/>
+          <w:sz w:val="24"/>
+          <w:szCs w:val="24"/>
+        </w:rPr>
+        <w:t>345</w:t>
       </w:r>
       <w:r>
         <w:rPr>

</xml_diff>